<commit_message>
feat(converter): implement native bookmark anchors, manual TOC placement, footnotes, 12 callouts, and typography extensions (v1.0.2)
</commit_message>
<xml_diff>
--- a/demo-sample.docx
+++ b/demo-sample.docx
@@ -27,7 +27,7 @@
           <w:sz w:val="24"/>
           <w:szCs w:val="24"/>
         </w:rPr>
-        <w:t xml:space="preserve">High-Performance Cloud Infrastructure &amp; Developer Productivity</w:t>
+        <w:t xml:space="preserve">High-Performance Cloud Infrastructure, Developer Productivity &amp; Documentation Standard</w:t>
       </w:r>
     </w:p>
     <w:p>
@@ -40,7 +40,7 @@
           <w:sz w:val="19"/>
           <w:szCs w:val="19"/>
         </w:rPr>
-        <w:t xml:space="preserve">Author: Jehadur RE  |  Date: 2026-09-03  |  Version: v2.4  |  Status: APPROVED</w:t>
+        <w:t xml:space="preserve">Author: Jehadur RE  |  Date: 2026-09-03  |  Version: v2.5  |  Status: APPROVED</w:t>
       </w:r>
     </w:p>
     <w:p>
@@ -56,7 +56,7 @@
         <w:spacing w:after="140"/>
       </w:pPr>
       <w:r>
-        <w:t xml:space="preserve">This strategic document outlines our engineering roadmap, cloud architecture milestones, and developer productivity enhancements. Designed to be converted directly into an executive </w:t>
+        <w:t xml:space="preserve">This strategic document outlines our engineering roadmap, cloud architecture milestones, and developer productivity enhancements&lt;sup&gt;&lt;a href="#fn-1" name="fnref-1" style="color: #2563EB; font-weight: 700; text-decoration: none; padding: 0 1pt;"&gt;[1]&lt;/a&gt;&lt;/sup&gt;. Designed to be converted directly into an executive </w:t>
       </w:r>
       <w:r>
         <w:rPr>
@@ -66,7 +66,7 @@
         <w:t xml:space="preserve">Google Docs</w:t>
       </w:r>
       <w:r>
-        <w:t xml:space="preserve"> report, preserving typographic harmony, table formatting, and syntax highlighting.</w:t>
+        <w:t xml:space="preserve"> report, preserving typographic harmony, table formatting, callouts, and syntax highlighting.</w:t>
       </w:r>
     </w:p>
     <w:p>
@@ -92,7 +92,31 @@
           <w:iCs/>
           <w:color w:val="64748B"/>
         </w:rPr>
-        <w:t xml:space="preserve">All specifications in this document adhere strictly to the highest industrial enterprise standards.</w:t>
+        <w:t xml:space="preserve">All specifications in this document adhere strictly to the highest industrial enterprise standards&lt;sup&gt;&lt;a href="#fn-arch-study" name="fnref-arch-study" style="color: #2563EB; font-weight: 700; text-decoration: none; padding: 0 1pt;"&gt;[arch-study]&lt;/a&gt;&lt;/sup&gt;.</w:t>
+      </w:r>
+    </w:p>
+    <w:p>
+      <w:pPr>
+        <w:spacing w:after="140"/>
+      </w:pPr>
+      <w:r>
+        <w:t xml:space="preserve">---</w:t>
+      </w:r>
+    </w:p>
+    <w:p>
+      <w:pPr>
+        <w:pStyle w:val="Heading1"/>
+      </w:pPr>
+      <w:r>
+        <w:t xml:space="preserve">Table of Contents</w:t>
+      </w:r>
+    </w:p>
+    <w:p>
+      <w:pPr>
+        <w:spacing w:after="140"/>
+      </w:pPr>
+      <w:r>
+        <w:t xml:space="preserve">&lt;!-- DOCUMENT_TOC_PLACEHOLDER --&gt;</w:t>
       </w:r>
     </w:p>
     <w:p>
@@ -214,7 +238,7 @@
           <w:iCs/>
           <w:color w:val="64748B"/>
         </w:rPr>
-        <w:t xml:space="preserve">Use the **"Copy for Google Docs"** command (`Ctrl+Shift+P` -&gt; `Copy for Google Docs`) for 1-click clipboard paste directly into any Google Doc with 100% style fidelity.</w:t>
+        <w:t xml:space="preserve">Use the **"Copy for Google Docs"** command (`Ctrl+Shift+P` -&gt; `Copy for Google Docs`), then press &lt;kbd style="display: inline-block; padding: 1.5pt 5pt; font-size: 8.5pt; font-family: monospace; line-height: 1.2; color: #1E293B; background-color: #F1F5F9; border: 1pt solid #CBD5E1; border-radius: 3pt; box-shadow: 0 1pt 0 #94A3B8;"&gt;Ctrl&lt;/kbd&gt; + &lt;kbd style="display: inline-block; padding: 1.5pt 5pt; font-size: 8.5pt; font-family: monospace; line-height: 1.2; color: #1E293B; background-color: #F1F5F9; border: 1pt solid #CBD5E1; border-radius: 3pt; box-shadow: 0 1pt 0 #94A3B8;"&gt;V&lt;/kbd&gt; inside any Google Doc for 100% style fidelity!</w:t>
       </w:r>
     </w:p>
     <w:p>
@@ -230,6 +254,300 @@
         <w:pStyle w:val="Heading1"/>
       </w:pPr>
       <w:r>
+        <w:t xml:space="preserve">Extended Alert Admonitions</w:t>
+      </w:r>
+    </w:p>
+    <w:p>
+      <w:pPr>
+        <w:spacing w:after="140"/>
+      </w:pPr>
+      <w:r>
+        <w:t xml:space="preserve">The converter natively formats 12 distinct callout alert types as Google Docs single-cell tables:</w:t>
+      </w:r>
+    </w:p>
+    <w:p>
+      <w:pPr>
+        <w:spacing w:before="120" w:after="120"/>
+      </w:pPr>
+      <w:r>
+        <w:rPr>
+          <w:i/>
+          <w:iCs/>
+          <w:color w:val="64748B"/>
+        </w:rPr>
+        <w:t xml:space="preserve">[[CALLOUT:info:Information]]</w:t>
+      </w:r>
+    </w:p>
+    <w:p>
+      <w:pPr>
+        <w:spacing w:before="120" w:after="120"/>
+      </w:pPr>
+      <w:r>
+        <w:rPr>
+          <w:i/>
+          <w:iCs/>
+          <w:color w:val="64748B"/>
+        </w:rPr>
+        <w:t xml:space="preserve">Real-time streaming metrics are collected and aggregated via Google Cloud Pub/Sub.</w:t>
+      </w:r>
+    </w:p>
+    <w:p>
+      <w:pPr>
+        <w:spacing w:before="120" w:after="120"/>
+      </w:pPr>
+      <w:r>
+        <w:rPr>
+          <w:i/>
+          <w:iCs/>
+          <w:color w:val="64748B"/>
+        </w:rPr>
+        <w:t xml:space="preserve">[[CALLOUT:success:Verification Complete]]</w:t>
+      </w:r>
+    </w:p>
+    <w:p>
+      <w:pPr>
+        <w:spacing w:before="120" w:after="120"/>
+      </w:pPr>
+      <w:r>
+        <w:rPr>
+          <w:i/>
+          <w:iCs/>
+          <w:color w:val="64748B"/>
+        </w:rPr>
+        <w:t xml:space="preserve">Automated test suite passed with 18 of 18 checks verified.</w:t>
+      </w:r>
+    </w:p>
+    <w:p>
+      <w:pPr>
+        <w:spacing w:before="120" w:after="120"/>
+      </w:pPr>
+      <w:r>
+        <w:rPr>
+          <w:i/>
+          <w:iCs/>
+          <w:color w:val="64748B"/>
+        </w:rPr>
+        <w:t xml:space="preserve">[[CALLOUT:question:Need Guidance?]]</w:t>
+      </w:r>
+    </w:p>
+    <w:p>
+      <w:pPr>
+        <w:spacing w:before="120" w:after="120"/>
+      </w:pPr>
+      <w:r>
+        <w:rPr>
+          <w:i/>
+          <w:iCs/>
+          <w:color w:val="64748B"/>
+        </w:rPr>
+        <w:t xml:space="preserve">Refer to the internal Developer Portal FAQ or reach out to `#platform-engineering`.</w:t>
+      </w:r>
+    </w:p>
+    <w:p>
+      <w:pPr>
+        <w:spacing w:before="120" w:after="120"/>
+      </w:pPr>
+      <w:r>
+        <w:rPr>
+          <w:i/>
+          <w:iCs/>
+          <w:color w:val="64748B"/>
+        </w:rPr>
+        <w:t xml:space="preserve">[[CALLOUT:todo:Action Item]]</w:t>
+      </w:r>
+    </w:p>
+    <w:p>
+      <w:pPr>
+        <w:spacing w:before="120" w:after="120"/>
+      </w:pPr>
+      <w:r>
+        <w:rPr>
+          <w:i/>
+          <w:iCs/>
+          <w:color w:val="64748B"/>
+        </w:rPr>
+        <w:t xml:space="preserve">Complete load testing on secondary staging cluster before Friday.</w:t>
+      </w:r>
+    </w:p>
+    <w:p>
+      <w:pPr>
+        <w:spacing w:before="120" w:after="120"/>
+      </w:pPr>
+      <w:r>
+        <w:rPr>
+          <w:i/>
+          <w:iCs/>
+          <w:color w:val="64748B"/>
+        </w:rPr>
+        <w:t xml:space="preserve">[[CALLOUT:example:Usage Example]]</w:t>
+      </w:r>
+    </w:p>
+    <w:p>
+      <w:pPr>
+        <w:spacing w:before="120" w:after="120"/>
+      </w:pPr>
+      <w:r>
+        <w:rPr>
+          <w:i/>
+          <w:iCs/>
+          <w:color w:val="64748B"/>
+        </w:rPr>
+        <w:t xml:space="preserve">Example command line execution: `npm test` runs all unit tests.</w:t>
+      </w:r>
+    </w:p>
+    <w:p>
+      <w:pPr>
+        <w:spacing w:before="120" w:after="120"/>
+      </w:pPr>
+      <w:r>
+        <w:rPr>
+          <w:i/>
+          <w:iCs/>
+          <w:color w:val="64748B"/>
+        </w:rPr>
+        <w:t xml:space="preserve">[[CALLOUT:warning:Token Expiration]]</w:t>
+      </w:r>
+    </w:p>
+    <w:p>
+      <w:pPr>
+        <w:spacing w:before="120" w:after="120"/>
+      </w:pPr>
+      <w:r>
+        <w:rPr>
+          <w:i/>
+          <w:iCs/>
+          <w:color w:val="64748B"/>
+        </w:rPr>
+        <w:t xml:space="preserve">Expired tokens must be refreshed automatically before executing batch upload operations.</w:t>
+      </w:r>
+    </w:p>
+    <w:p>
+      <w:pPr>
+        <w:spacing w:before="120" w:after="120"/>
+      </w:pPr>
+      <w:r>
+        <w:rPr>
+          <w:i/>
+          <w:iCs/>
+          <w:color w:val="64748B"/>
+        </w:rPr>
+        <w:t xml:space="preserve">[[CALLOUT:danger:Critical Failure Safeguard]]</w:t>
+      </w:r>
+    </w:p>
+    <w:p>
+      <w:pPr>
+        <w:spacing w:before="120" w:after="120"/>
+      </w:pPr>
+      <w:r>
+        <w:rPr>
+          <w:i/>
+          <w:iCs/>
+          <w:color w:val="64748B"/>
+        </w:rPr>
+        <w:t xml:space="preserve">Automatic circuit breakers will trip if downstream failure exceeds 5% within a 60-second window.</w:t>
+      </w:r>
+    </w:p>
+    <w:p>
+      <w:pPr>
+        <w:spacing w:after="140"/>
+      </w:pPr>
+      <w:r>
+        <w:t xml:space="preserve">---</w:t>
+      </w:r>
+    </w:p>
+    <w:p>
+      <w:pPr>
+        <w:pStyle w:val="Heading1"/>
+      </w:pPr>
+      <w:r>
+        <w:t xml:space="preserve">Advanced Typography &amp; Formatting</w:t>
+      </w:r>
+    </w:p>
+    <w:p>
+      <w:pPr>
+        <w:spacing w:after="140"/>
+      </w:pPr>
+      <w:r>
+        <w:t xml:space="preserve">- </w:t>
+      </w:r>
+      <w:r>
+        <w:rPr>
+          <w:b/>
+          <w:bCs/>
+        </w:rPr>
+        <w:t xml:space="preserve">Inline Text Highlighting</w:t>
+      </w:r>
+      <w:r>
+        <w:t xml:space="preserve">: Critical security alerts require &lt;mark style="background-color: #FEF08A; color: #713F12; padding: 1.5pt 4pt; border-radius: 2pt;"&gt;immediate operator attention&lt;/mark&gt;.</w:t>
+      </w:r>
+    </w:p>
+    <w:p>
+      <w:pPr>
+        <w:spacing w:after="140"/>
+      </w:pPr>
+      <w:r>
+        <w:t xml:space="preserve">- </w:t>
+      </w:r>
+      <w:r>
+        <w:rPr>
+          <w:b/>
+          <w:bCs/>
+        </w:rPr>
+        <w:t xml:space="preserve">Subscript &amp; Superscript</w:t>
+      </w:r>
+      <w:r>
+        <w:t xml:space="preserve">: Chemical notation &lt;span style="font-family: 'Cambria Math', 'Latin Modern Math', 'Times New Roman', serif; font-size: 11pt; font-style: italic; color: #0F172A; padding: 0 2pt;"&gt;H_2O&lt;/span&gt; is written as H&lt;sub style="font-size: 75%; line-height: 0; vertical-align: sub;"&gt;2&lt;/sub&gt;O, while exponential scaling is &lt;span style="font-family: 'Cambria Math', 'Latin Modern Math', 'Times New Roman', serif; font-size: 11pt; font-style: italic; color: #0F172A; padding: 0 2pt;"&gt;2^{32}&lt;/span&gt; written as 2&lt;sup style="font-size: 75%; line-height: 0; vertical-align: super;"&gt;32&lt;/sup&gt;.</w:t>
+      </w:r>
+    </w:p>
+    <w:p>
+      <w:pPr>
+        <w:spacing w:after="140"/>
+      </w:pPr>
+      <w:r>
+        <w:t xml:space="preserve">- </w:t>
+      </w:r>
+      <w:r>
+        <w:rPr>
+          <w:b/>
+          <w:bCs/>
+        </w:rPr>
+        <w:t xml:space="preserve">Editorial Insertions</w:t>
+      </w:r>
+      <w:r>
+        <w:t xml:space="preserve">: Deprecated APIs were replaced with &lt;ins style="text-decoration: underline; background-color: #DCFCE7; padding: 1pt 2pt;"&gt;modern REST endpoints&lt;/ins&gt;.</w:t>
+      </w:r>
+    </w:p>
+    <w:p>
+      <w:pPr>
+        <w:spacing w:after="140"/>
+      </w:pPr>
+      <w:r>
+        <w:t xml:space="preserve">- </w:t>
+      </w:r>
+      <w:r>
+        <w:rPr>
+          <w:b/>
+          <w:bCs/>
+        </w:rPr>
+        <w:t xml:space="preserve">Keyboard Shortcuts</w:t>
+      </w:r>
+      <w:r>
+        <w:t xml:space="preserve">: Press &lt;kbd style="display: inline-block; padding: 1.5pt 5pt; font-size: 8.5pt; font-family: monospace; line-height: 1.2; color: #1E293B; background-color: #F1F5F9; border: 1pt solid #CBD5E1; border-radius: 3pt; box-shadow: 0 1pt 0 #94A3B8;"&gt;Ctrl&lt;/kbd&gt; + &lt;kbd style="display: inline-block; padding: 1.5pt 5pt; font-size: 8.5pt; font-family: monospace; line-height: 1.2; color: #1E293B; background-color: #F1F5F9; border: 1pt solid #CBD5E1; border-radius: 3pt; box-shadow: 0 1pt 0 #94A3B8;"&gt;Shift&lt;/kbd&gt; + &lt;kbd style="display: inline-block; padding: 1.5pt 5pt; font-size: 8.5pt; font-family: monospace; line-height: 1.2; color: #1E293B; background-color: #F1F5F9; border: 1pt solid #CBD5E1; border-radius: 3pt; box-shadow: 0 1pt 0 #94A3B8;"&gt;P&lt;/kbd&gt; to open the Command Palette.</w:t>
+      </w:r>
+    </w:p>
+    <w:p>
+      <w:pPr>
+        <w:spacing w:after="140"/>
+      </w:pPr>
+      <w:r>
+        <w:t xml:space="preserve">---</w:t>
+      </w:r>
+    </w:p>
+    <w:p>
+      <w:pPr>
+        <w:pStyle w:val="Heading1"/>
+      </w:pPr>
+      <w:r>
         <w:t xml:space="preserve">System Benchmark &amp; Latency Analysis</w:t>
       </w:r>
     </w:p>
@@ -238,7 +556,7 @@
         <w:spacing w:after="140"/>
       </w:pPr>
       <w:r>
-        <w:t xml:space="preserve">The following table summarizes the response times and throughput under peak load:</w:t>
+        <w:t xml:space="preserve">The following table summarizes response times and throughput under peak load:</w:t>
       </w:r>
     </w:p>
     <w:tbl>
@@ -1228,6 +1546,197 @@
         <w:spacing w:after="140"/>
       </w:pPr>
       <w:r>
+        <w:t xml:space="preserve">And in Python for automated report generation:</w:t>
+      </w:r>
+    </w:p>
+    <w:tbl>
+      <w:tblPr>
+        <w:tblW w:type="pct" w:w="100%"/>
+        <w:tblBorders>
+          <w:top w:val="single" w:color="auto" w:sz="4"/>
+          <w:left w:val="single" w:color="auto" w:sz="4"/>
+          <w:bottom w:val="single" w:color="auto" w:sz="4"/>
+          <w:right w:val="single" w:color="auto" w:sz="4"/>
+          <w:insideH w:val="single" w:color="auto" w:sz="4"/>
+          <w:insideV w:val="single" w:color="auto" w:sz="4"/>
+        </w:tblBorders>
+      </w:tblPr>
+      <w:tblGrid>
+        <w:gridCol w:w="100"/>
+      </w:tblGrid>
+      <w:tr>
+        <w:tc>
+          <w:tcPr>
+            <w:shd w:fill="F8FAFC" w:val="clear"/>
+            <w:tcMar>
+              <w:top w:type="dxa" w:w="160"/>
+              <w:left w:type="dxa" w:w="240"/>
+              <w:bottom w:type="dxa" w:w="160"/>
+              <w:right w:type="dxa" w:w="240"/>
+            </w:tcMar>
+          </w:tcPr>
+          <w:p>
+            <w:pPr>
+              <w:spacing w:line="240" w:after="40"/>
+            </w:pPr>
+            <w:r>
+              <w:rPr>
+                <w:color w:val="0F172A"/>
+                <w:sz w:val="19"/>
+                <w:szCs w:val="19"/>
+                <w:rFonts w:ascii="Consolas" w:cs="Consolas" w:eastAsia="Consolas" w:hAnsi="Consolas"/>
+              </w:rPr>
+              <w:t xml:space="preserve">import requests</w:t>
+            </w:r>
+          </w:p>
+          <w:p>
+            <w:pPr>
+              <w:spacing w:line="240" w:after="40"/>
+            </w:pPr>
+            <w:r>
+              <w:rPr>
+                <w:color w:val="0F172A"/>
+                <w:sz w:val="19"/>
+                <w:szCs w:val="19"/>
+                <w:rFonts w:ascii="Consolas" w:cs="Consolas" w:eastAsia="Consolas" w:hAnsi="Consolas"/>
+              </w:rPr>
+              <w:t xml:space="preserve"> </w:t>
+            </w:r>
+          </w:p>
+          <w:p>
+            <w:pPr>
+              <w:spacing w:line="240" w:after="40"/>
+            </w:pPr>
+            <w:r>
+              <w:rPr>
+                <w:color w:val="0F172A"/>
+                <w:sz w:val="19"/>
+                <w:szCs w:val="19"/>
+                <w:rFonts w:ascii="Consolas" w:cs="Consolas" w:eastAsia="Consolas" w:hAnsi="Consolas"/>
+              </w:rPr>
+              <w:t xml:space="preserve">def upload_gdoc(title: str, html_payload: str, token: str) -&gt; str:</w:t>
+            </w:r>
+          </w:p>
+          <w:p>
+            <w:pPr>
+              <w:spacing w:line="240" w:after="40"/>
+            </w:pPr>
+            <w:r>
+              <w:rPr>
+                <w:color w:val="0F172A"/>
+                <w:sz w:val="19"/>
+                <w:szCs w:val="19"/>
+                <w:rFonts w:ascii="Consolas" w:cs="Consolas" w:eastAsia="Consolas" w:hAnsi="Consolas"/>
+              </w:rPr>
+              <w:t xml:space="preserve">    """Uploads styled HTML directly to Google Drive as a native Google Doc."""</w:t>
+            </w:r>
+          </w:p>
+          <w:p>
+            <w:pPr>
+              <w:spacing w:line="240" w:after="40"/>
+            </w:pPr>
+            <w:r>
+              <w:rPr>
+                <w:color w:val="0F172A"/>
+                <w:sz w:val="19"/>
+                <w:szCs w:val="19"/>
+                <w:rFonts w:ascii="Consolas" w:cs="Consolas" w:eastAsia="Consolas" w:hAnsi="Consolas"/>
+              </w:rPr>
+              <w:t xml:space="preserve">    headers = {"Authorization": f"Bearer {token}"}</w:t>
+            </w:r>
+          </w:p>
+          <w:p>
+            <w:pPr>
+              <w:spacing w:line="240" w:after="40"/>
+            </w:pPr>
+            <w:r>
+              <w:rPr>
+                <w:color w:val="0F172A"/>
+                <w:sz w:val="19"/>
+                <w:szCs w:val="19"/>
+                <w:rFonts w:ascii="Consolas" w:cs="Consolas" w:eastAsia="Consolas" w:hAnsi="Consolas"/>
+              </w:rPr>
+              <w:t xml:space="preserve">    files = {</w:t>
+            </w:r>
+          </w:p>
+          <w:p>
+            <w:pPr>
+              <w:spacing w:line="240" w:after="40"/>
+            </w:pPr>
+            <w:r>
+              <w:rPr>
+                <w:color w:val="0F172A"/>
+                <w:sz w:val="19"/>
+                <w:szCs w:val="19"/>
+                <w:rFonts w:ascii="Consolas" w:cs="Consolas" w:eastAsia="Consolas" w:hAnsi="Consolas"/>
+              </w:rPr>
+              <w:t xml:space="preserve">        'data': ('metadata', '{"name": "' + title + '", "mimeType": "application/vnd.google-apps.document"}', 'application/json'),</w:t>
+            </w:r>
+          </w:p>
+          <w:p>
+            <w:pPr>
+              <w:spacing w:line="240" w:after="40"/>
+            </w:pPr>
+            <w:r>
+              <w:rPr>
+                <w:color w:val="0F172A"/>
+                <w:sz w:val="19"/>
+                <w:szCs w:val="19"/>
+                <w:rFonts w:ascii="Consolas" w:cs="Consolas" w:eastAsia="Consolas" w:hAnsi="Consolas"/>
+              </w:rPr>
+              <w:t xml:space="preserve">        'file': ('content.html', html_payload, 'text/html')</w:t>
+            </w:r>
+          </w:p>
+          <w:p>
+            <w:pPr>
+              <w:spacing w:line="240" w:after="40"/>
+            </w:pPr>
+            <w:r>
+              <w:rPr>
+                <w:color w:val="0F172A"/>
+                <w:sz w:val="19"/>
+                <w:szCs w:val="19"/>
+                <w:rFonts w:ascii="Consolas" w:cs="Consolas" w:eastAsia="Consolas" w:hAnsi="Consolas"/>
+              </w:rPr>
+              <w:t xml:space="preserve">    }</w:t>
+            </w:r>
+          </w:p>
+          <w:p>
+            <w:pPr>
+              <w:spacing w:line="240" w:after="40"/>
+            </w:pPr>
+            <w:r>
+              <w:rPr>
+                <w:color w:val="0F172A"/>
+                <w:sz w:val="19"/>
+                <w:szCs w:val="19"/>
+                <w:rFonts w:ascii="Consolas" w:cs="Consolas" w:eastAsia="Consolas" w:hAnsi="Consolas"/>
+              </w:rPr>
+              <w:t xml:space="preserve">    response = requests.post("https://www.googleapis.com/upload/drive/v3/files?uploadType=multipart", headers=headers, files=files)</w:t>
+            </w:r>
+          </w:p>
+          <w:p>
+            <w:pPr>
+              <w:spacing w:line="240" w:after="40"/>
+            </w:pPr>
+            <w:r>
+              <w:rPr>
+                <w:color w:val="0F172A"/>
+                <w:sz w:val="19"/>
+                <w:szCs w:val="19"/>
+                <w:rFonts w:ascii="Consolas" w:cs="Consolas" w:eastAsia="Consolas" w:hAnsi="Consolas"/>
+              </w:rPr>
+              <w:t xml:space="preserve">    return response.json().get("id")</w:t>
+            </w:r>
+          </w:p>
+        </w:tc>
+      </w:tr>
+    </w:tbl>
+    <w:p>
+      <w:pPr>
+        <w:spacing w:after="140"/>
+      </w:pPr>
+      <w:r>
         <w:t xml:space="preserve">Inline code elements like </w:t>
       </w:r>
       <w:r>
@@ -1344,7 +1853,31 @@
         <w:spacing w:after="140"/>
       </w:pPr>
       <w:r>
-        <w:t xml:space="preserve">- ☑ ~~Support 1-Click zero-config Rich Clipboard copy (</w:t>
+        <w:t xml:space="preserve">- ☑ ~~Support 1-Click zero-config Rich Clipboard copy (&lt;kbd style="display: inline-block; padding: 1.5pt 5pt; font-size: 8.5pt; font-family: monospace; line-height: 1.2; color: #1E293B; background-color: #F1F5F9; border: 1pt solid #CBD5E1; border-radius: 3pt; box-shadow: 0 1pt 0 #94A3B8;"&gt;Ctrl&lt;/kbd&gt; + &lt;kbd style="display: inline-block; padding: 1.5pt 5pt; font-size: 8.5pt; font-family: monospace; line-height: 1.2; color: #1E293B; background-color: #F1F5F9; border: 1pt solid #CBD5E1; border-radius: 3pt; box-shadow: 0 1pt 0 #94A3B8;"&gt;V&lt;/kbd&gt; into Google Docs)~~</w:t>
+      </w:r>
+    </w:p>
+    <w:p>
+      <w:pPr>
+        <w:spacing w:after="140"/>
+      </w:pPr>
+      <w:r>
+        <w:t xml:space="preserve">- ☑ ~~Build Live Side-by-Side Google Docs Preview Webview with smooth anchor jumping~~</w:t>
+      </w:r>
+    </w:p>
+    <w:p>
+      <w:pPr>
+        <w:spacing w:after="140"/>
+      </w:pPr>
+      <w:r>
+        <w:t xml:space="preserve">- ☑ ~~Provide local HTML and DOCX export capabilities~~</w:t>
+      </w:r>
+    </w:p>
+    <w:p>
+      <w:pPr>
+        <w:spacing w:after="140"/>
+      </w:pPr>
+      <w:r>
+        <w:t xml:space="preserve">- ☑ ~~Implement native </w:t>
       </w:r>
       <w:r>
         <w:rPr>
@@ -1353,86 +1886,90 @@
           <w:szCs w:val="20"/>
           <w:rFonts w:ascii="Consolas" w:cs="Consolas" w:eastAsia="Consolas" w:hAnsi="Consolas"/>
         </w:rPr>
-        <w:t xml:space="preserve">Ctrl+V</w:t>
-      </w:r>
-      <w:r>
-        <w:t xml:space="preserve"> into Google Docs)~~</w:t>
-      </w:r>
-    </w:p>
-    <w:p>
-      <w:pPr>
-        <w:spacing w:after="140"/>
-      </w:pPr>
-      <w:r>
-        <w:t xml:space="preserve">- ☑ ~~Build Live Side-by-Side Google Docs Preview Webview~~</w:t>
-      </w:r>
-    </w:p>
-    <w:p>
-      <w:pPr>
-        <w:spacing w:after="140"/>
-      </w:pPr>
-      <w:r>
-        <w:t xml:space="preserve">- ☑ ~~Provide local HTML and DOCX export capabilities~~</w:t>
-      </w:r>
-    </w:p>
-    <w:p>
-      <w:pPr>
-        <w:spacing w:after="140"/>
-      </w:pPr>
-      <w:r>
-        <w:t xml:space="preserve">- ☐ Schedule user walkthrough and feedback session</w:t>
-      </w:r>
-    </w:p>
-    <w:p>
-      <w:pPr>
-        <w:spacing w:before="120" w:after="120"/>
-      </w:pPr>
-      <w:r>
-        <w:rPr>
-          <w:i/>
-          <w:iCs/>
-          <w:color w:val="64748B"/>
-        </w:rPr>
-        <w:t xml:space="preserve">[[CALLOUT:warning:]]</w:t>
-      </w:r>
-    </w:p>
-    <w:p>
-      <w:pPr>
-        <w:spacing w:before="120" w:after="120"/>
-      </w:pPr>
-      <w:r>
-        <w:rPr>
-          <w:i/>
-          <w:iCs/>
-          <w:color w:val="64748B"/>
-        </w:rPr>
-        <w:t xml:space="preserve">Expired tokens must be refreshed automatically before executing batch upload operations.</w:t>
-      </w:r>
-    </w:p>
-    <w:p>
-      <w:pPr>
-        <w:spacing w:before="120" w:after="120"/>
-      </w:pPr>
-      <w:r>
-        <w:rPr>
-          <w:i/>
-          <w:iCs/>
-          <w:color w:val="64748B"/>
-        </w:rPr>
-        <w:t xml:space="preserve">[[CALLOUT:caution:]]</w:t>
-      </w:r>
-    </w:p>
-    <w:p>
-      <w:pPr>
-        <w:spacing w:before="120" w:after="120"/>
-      </w:pPr>
-      <w:r>
-        <w:rPr>
-          <w:i/>
-          <w:iCs/>
-          <w:color w:val="64748B"/>
-        </w:rPr>
-        <w:t xml:space="preserve">Never commit Google Cloud Client Secrets or Service Account Private Keys directly to version control.</w:t>
+        <w:t xml:space="preserve">&lt;a name="..."&gt;</w:t>
+      </w:r>
+      <w:r>
+        <w:t xml:space="preserve"> bookmarks for Table of Contents &amp; Cross-References~~</w:t>
+      </w:r>
+    </w:p>
+    <w:p>
+      <w:pPr>
+        <w:spacing w:after="140"/>
+      </w:pPr>
+      <w:r>
+        <w:t xml:space="preserve">- ☑ ~~Support manual </w:t>
+      </w:r>
+      <w:r>
+        <w:rPr>
+          <w:color w:val="2563EB"/>
+          <w:sz w:val="20"/>
+          <w:szCs w:val="20"/>
+          <w:rFonts w:ascii="Consolas" w:cs="Consolas" w:eastAsia="Consolas" w:hAnsi="Consolas"/>
+        </w:rPr>
+        <w:t xml:space="preserve">[TOC]</w:t>
+      </w:r>
+      <w:r>
+        <w:t xml:space="preserve"> placement and configurable </w:t>
+      </w:r>
+      <w:r>
+        <w:rPr>
+          <w:color w:val="2563EB"/>
+          <w:sz w:val="20"/>
+          <w:szCs w:val="20"/>
+          <w:rFonts w:ascii="Consolas" w:cs="Consolas" w:eastAsia="Consolas" w:hAnsi="Consolas"/>
+        </w:rPr>
+        <w:t xml:space="preserve">toc_depth</w:t>
+      </w:r>
+      <w:r>
+        <w:t xml:space="preserve">~~</w:t>
+      </w:r>
+    </w:p>
+    <w:p>
+      <w:pPr>
+        <w:spacing w:after="140"/>
+      </w:pPr>
+      <w:r>
+        <w:t xml:space="preserve">- ☑ ~~Support Footnotes citations with bidirectional links~~</w:t>
+      </w:r>
+    </w:p>
+    <w:p>
+      <w:pPr>
+        <w:spacing w:after="140"/>
+      </w:pPr>
+      <w:r>
+        <w:t xml:space="preserve">- ☑ ~~Extended callout admonitions (12 types)~~</w:t>
+      </w:r>
+    </w:p>
+    <w:p>
+      <w:pPr>
+        <w:spacing w:after="140"/>
+      </w:pPr>
+      <w:r>
+        <w:t xml:space="preserve">- ☐ Conduct final user walkthrough</w:t>
+      </w:r>
+    </w:p>
+    <w:p>
+      <w:pPr>
+        <w:spacing w:after="140"/>
+      </w:pPr>
+      <w:r>
+        <w:t xml:space="preserve">---</w:t>
+      </w:r>
+    </w:p>
+    <w:p>
+      <w:pPr>
+        <w:spacing w:after="140"/>
+      </w:pPr>
+      <w:r>
+        <w:t xml:space="preserve">[Back to Top](#top)</w:t>
+      </w:r>
+    </w:p>
+    <w:p>
+      <w:pPr>
+        <w:spacing w:after="140"/>
+      </w:pPr>
+      <w:r>
+        <w:t xml:space="preserve">---</w:t>
       </w:r>
     </w:p>
     <w:sectPr>

</xml_diff>

<commit_message>
feat(enterprise): add running headers & footers with pagination, page breaks, watermarks, stats, and 27 passing tests
</commit_message>
<xml_diff>
--- a/demo-sample.docx
+++ b/demo-sample.docx
@@ -40,7 +40,7 @@
           <w:sz w:val="19"/>
           <w:szCs w:val="19"/>
         </w:rPr>
-        <w:t xml:space="preserve">Author: Jehadur RE  |  Date: 2026-09-03  |  Version: v2.5  |  Status: APPROVED</w:t>
+        <w:t xml:space="preserve">Author: Jehadur RE  |  Date: 2026-09-03  |  Version: v2.5  |  Status: APPROVED  |  Reading Time: ~4 min (704 words)</w:t>
       </w:r>
     </w:p>
     <w:p>
@@ -128,11 +128,144 @@
       </w:r>
     </w:p>
     <w:p>
+      <w:r>
+        <w:br w:type="page"/>
+      </w:r>
+    </w:p>
+    <w:p>
       <w:pPr>
         <w:pStyle w:val="Heading1"/>
       </w:pPr>
       <w:r>
         <w:t xml:space="preserve">Architecture Pillars</w:t>
+      </w:r>
+    </w:p>
+    <w:p>
+      <w:pPr>
+        <w:spacing w:after="140"/>
+      </w:pPr>
+      <w:r>
+        <w:t xml:space="preserve">&lt;table style="width: 100%; border-collapse: collapse; margin: 16pt 0; background-color: #F8FAFC; border: 1.5pt solid #CBD5E1; border-radius: 8pt;"&gt;</w:t>
+      </w:r>
+    </w:p>
+    <w:p>
+      <w:pPr>
+        <w:spacing w:after="140"/>
+      </w:pPr>
+      <w:r>
+        <w:t xml:space="preserve">  &lt;tr&gt;</w:t>
+      </w:r>
+    </w:p>
+    <w:p>
+      <w:pPr>
+        <w:spacing w:after="140"/>
+      </w:pPr>
+      <w:r>
+        <w:t xml:space="preserve">    &lt;td style="padding: 8pt 14pt; background-color: #F1F5F9; border-bottom: 1pt solid #E2E8F0; font-family: Inter, Roboto, -apple-system, BlinkMacSystemFont, 'Segoe UI', Arial, sans-serif; font-size: 9pt; font-weight: 700; color: #0F172A;"&gt;</w:t>
+      </w:r>
+    </w:p>
+    <w:p>
+      <w:pPr>
+        <w:spacing w:after="140"/>
+      </w:pPr>
+      <w:r>
+        <w:t xml:space="preserve">      📊 DIAGRAM: GRAPH TD</w:t>
+      </w:r>
+    </w:p>
+    <w:p>
+      <w:pPr>
+        <w:spacing w:after="140"/>
+      </w:pPr>
+      <w:r>
+        <w:t xml:space="preserve">    &lt;/td&gt;</w:t>
+      </w:r>
+    </w:p>
+    <w:p>
+      <w:pPr>
+        <w:spacing w:after="140"/>
+      </w:pPr>
+      <w:r>
+        <w:t xml:space="preserve">  &lt;/tr&gt;</w:t>
+      </w:r>
+    </w:p>
+    <w:p>
+      <w:pPr>
+        <w:spacing w:after="140"/>
+      </w:pPr>
+      <w:r>
+        <w:t xml:space="preserve">  &lt;tr&gt;</w:t>
+      </w:r>
+    </w:p>
+    <w:p>
+      <w:pPr>
+        <w:spacing w:after="140"/>
+      </w:pPr>
+      <w:r>
+        <w:t xml:space="preserve">    &lt;td style="padding: 14pt 18pt; font-family: 'JetBrains Mono', Consolas, monospace; font-size: 9.5pt; line-height: 1.6; color: #1E293B; background-color: #FFFFFF;"&gt;</w:t>
+      </w:r>
+    </w:p>
+    <w:p>
+      <w:pPr>
+        <w:spacing w:after="140"/>
+      </w:pPr>
+      <w:r>
+        <w:t xml:space="preserve">      &lt;pre style="margin: 0; padding: 0; white-space: pre-wrap; font-family: inherit; font-size: inherit; color: inherit;"&gt;graph TD</w:t>
+      </w:r>
+    </w:p>
+    <w:p>
+      <w:pPr>
+        <w:spacing w:after="140"/>
+      </w:pPr>
+      <w:r>
+        <w:t xml:space="preserve">  Markdown[Source Markdown] --&amp;gt; AST[Engine Parser AST]</w:t>
+      </w:r>
+    </w:p>
+    <w:p>
+      <w:pPr>
+        <w:spacing w:after="140"/>
+      </w:pPr>
+      <w:r>
+        <w:t xml:space="preserve">  AST --&amp;gt; GDocs[Google Docs Clipboard]</w:t>
+      </w:r>
+    </w:p>
+    <w:p>
+      <w:pPr>
+        <w:spacing w:after="140"/>
+      </w:pPr>
+      <w:r>
+        <w:t xml:space="preserve">  AST --&amp;gt; PDF[Print-Quality PDF]</w:t>
+      </w:r>
+    </w:p>
+    <w:p>
+      <w:pPr>
+        <w:spacing w:after="140"/>
+      </w:pPr>
+      <w:r>
+        <w:t xml:space="preserve">  AST --&amp;gt; DOCX[Executive DOCX]&lt;/pre&gt;</w:t>
+      </w:r>
+    </w:p>
+    <w:p>
+      <w:pPr>
+        <w:spacing w:after="140"/>
+      </w:pPr>
+      <w:r>
+        <w:t xml:space="preserve">    &lt;/td&gt;</w:t>
+      </w:r>
+    </w:p>
+    <w:p>
+      <w:pPr>
+        <w:spacing w:after="140"/>
+      </w:pPr>
+      <w:r>
+        <w:t xml:space="preserve">  &lt;/tr&gt;</w:t>
+      </w:r>
+    </w:p>
+    <w:p>
+      <w:pPr>
+        <w:spacing w:after="140"/>
+      </w:pPr>
+      <w:r>
+        <w:t xml:space="preserve">&lt;/table&gt;</w:t>
       </w:r>
     </w:p>
     <w:p>
@@ -213,6 +346,30 @@
       </w:r>
       <w:r>
         <w:t xml:space="preserve">: OAuth 2.0 PKCE authentication with encrypted OS-level token caching.</w:t>
+      </w:r>
+    </w:p>
+    <w:p>
+      <w:pPr>
+        <w:pStyle w:val="Heading3"/>
+      </w:pPr>
+      <w:r>
+        <w:t xml:space="preserve">Key Technical Definitions</w:t>
+      </w:r>
+    </w:p>
+    <w:p>
+      <w:pPr>
+        <w:spacing w:after="140"/>
+      </w:pPr>
+      <w:r>
+        <w:t xml:space="preserve">&lt;dl style="margin: 8pt 0;"&gt;&lt;dt style="font-weight: 700; color: #0F172A; font-family: Inter, Roboto, -apple-system, BlinkMacSystemFont, 'Segoe UI', Arial, sans-serif; margin-bottom: 2pt;"&gt;AST Engine&lt;/dt&gt;&lt;dd style="margin-left: 20pt; margin-bottom: 8pt; color: #1E293B; font-family: Inter, Roboto, -apple-system, BlinkMacSystemFont, 'Segoe UI', Arial, sans-serif;"&gt;Abstract Syntax Tree translating Markdown tokens into inline CSS styles.&lt;/dd&gt;&lt;/dl&gt;</w:t>
+      </w:r>
+    </w:p>
+    <w:p>
+      <w:pPr>
+        <w:spacing w:after="140"/>
+      </w:pPr>
+      <w:r>
+        <w:t xml:space="preserve">&lt;dl style="margin: 8pt 0;"&gt;&lt;dt style="font-weight: 700; color: #0F172A; font-family: Inter, Roboto, -apple-system, BlinkMacSystemFont, 'Segoe UI', Arial, sans-serif; margin-bottom: 2pt;"&gt;Native Bookmarks&lt;/dt&gt;&lt;dd style="margin-left: 20pt; margin-bottom: 8pt; color: #1E293B; font-family: Inter, Roboto, -apple-system, BlinkMacSystemFont, 'Segoe UI', Arial, sans-serif;"&gt;Google Docs named anchors enabling bidirectional Table of Contents jumping.&lt;/dd&gt;&lt;/dl&gt;</w:t>
       </w:r>
     </w:p>
     <w:p>
@@ -1817,127 +1974,139 @@
         <w:spacing w:after="140"/>
       </w:pPr>
       <w:r>
-        <w:t xml:space="preserve">- ☑ ~~Complete Markdown Parser AST with inline style translation~~</w:t>
-      </w:r>
-    </w:p>
-    <w:p>
-      <w:pPr>
-        <w:spacing w:after="140"/>
-      </w:pPr>
-      <w:r>
-        <w:t xml:space="preserve">- ☑ ~~Implement 5 Curated Professional Themes (Modern Slate, Executive Navy, Emerald, Crimson, Tech Violet)~~</w:t>
-      </w:r>
-    </w:p>
-    <w:p>
-      <w:pPr>
-        <w:spacing w:after="140"/>
-      </w:pPr>
-      <w:r>
-        <w:t xml:space="preserve">- ☑ ~~Build Google Drive API multipart upload with native </w:t>
-      </w:r>
-      <w:r>
-        <w:rPr>
-          <w:color w:val="2563EB"/>
-          <w:sz w:val="20"/>
-          <w:szCs w:val="20"/>
-          <w:rFonts w:ascii="Consolas" w:cs="Consolas" w:eastAsia="Consolas" w:hAnsi="Consolas"/>
-        </w:rPr>
-        <w:t xml:space="preserve">vnd.google-apps.document</w:t>
-      </w:r>
-      <w:r>
-        <w:t xml:space="preserve"> conversion~~</w:t>
-      </w:r>
-    </w:p>
-    <w:p>
-      <w:pPr>
-        <w:spacing w:after="140"/>
-      </w:pPr>
-      <w:r>
-        <w:t xml:space="preserve">- ☑ ~~Support 1-Click zero-config Rich Clipboard copy (&lt;kbd style="display: inline-block; padding: 1.5pt 5pt; font-size: 8.5pt; font-family: monospace; line-height: 1.2; color: #1E293B; background-color: #F1F5F9; border: 1pt solid #CBD5E1; border-radius: 3pt; box-shadow: 0 1pt 0 #94A3B8;"&gt;Ctrl&lt;/kbd&gt; + &lt;kbd style="display: inline-block; padding: 1.5pt 5pt; font-size: 8.5pt; font-family: monospace; line-height: 1.2; color: #1E293B; background-color: #F1F5F9; border: 1pt solid #CBD5E1; border-radius: 3pt; box-shadow: 0 1pt 0 #94A3B8;"&gt;V&lt;/kbd&gt; into Google Docs)~~</w:t>
-      </w:r>
-    </w:p>
-    <w:p>
-      <w:pPr>
-        <w:spacing w:after="140"/>
-      </w:pPr>
-      <w:r>
-        <w:t xml:space="preserve">- ☑ ~~Build Live Side-by-Side Google Docs Preview Webview with smooth anchor jumping~~</w:t>
-      </w:r>
-    </w:p>
-    <w:p>
-      <w:pPr>
-        <w:spacing w:after="140"/>
-      </w:pPr>
-      <w:r>
-        <w:t xml:space="preserve">- ☑ ~~Provide local HTML and DOCX export capabilities~~</w:t>
-      </w:r>
-    </w:p>
-    <w:p>
-      <w:pPr>
-        <w:spacing w:after="140"/>
-      </w:pPr>
-      <w:r>
-        <w:t xml:space="preserve">- ☑ ~~Implement native </w:t>
-      </w:r>
-      <w:r>
-        <w:rPr>
-          <w:color w:val="2563EB"/>
-          <w:sz w:val="20"/>
-          <w:szCs w:val="20"/>
-          <w:rFonts w:ascii="Consolas" w:cs="Consolas" w:eastAsia="Consolas" w:hAnsi="Consolas"/>
-        </w:rPr>
-        <w:t xml:space="preserve">&lt;a name="..."&gt;</w:t>
-      </w:r>
-      <w:r>
-        <w:t xml:space="preserve"> bookmarks for Table of Contents &amp; Cross-References~~</w:t>
-      </w:r>
-    </w:p>
-    <w:p>
-      <w:pPr>
-        <w:spacing w:after="140"/>
-      </w:pPr>
-      <w:r>
-        <w:t xml:space="preserve">- ☑ ~~Support manual </w:t>
-      </w:r>
-      <w:r>
-        <w:rPr>
-          <w:color w:val="2563EB"/>
-          <w:sz w:val="20"/>
-          <w:szCs w:val="20"/>
-          <w:rFonts w:ascii="Consolas" w:cs="Consolas" w:eastAsia="Consolas" w:hAnsi="Consolas"/>
-        </w:rPr>
-        <w:t xml:space="preserve">[TOC]</w:t>
-      </w:r>
-      <w:r>
-        <w:t xml:space="preserve"> placement and configurable </w:t>
-      </w:r>
-      <w:r>
-        <w:rPr>
-          <w:color w:val="2563EB"/>
-          <w:sz w:val="20"/>
-          <w:szCs w:val="20"/>
-          <w:rFonts w:ascii="Consolas" w:cs="Consolas" w:eastAsia="Consolas" w:hAnsi="Consolas"/>
-        </w:rPr>
-        <w:t xml:space="preserve">toc_depth</w:t>
-      </w:r>
-      <w:r>
-        <w:t xml:space="preserve">~~</w:t>
-      </w:r>
-    </w:p>
-    <w:p>
-      <w:pPr>
-        <w:spacing w:after="140"/>
-      </w:pPr>
-      <w:r>
-        <w:t xml:space="preserve">- ☑ ~~Support Footnotes citations with bidirectional links~~</w:t>
-      </w:r>
-    </w:p>
-    <w:p>
-      <w:pPr>
-        <w:spacing w:after="140"/>
-      </w:pPr>
-      <w:r>
-        <w:t xml:space="preserve">- ☑ ~~Extended callout admonitions (12 types)~~</w:t>
+        <w:t xml:space="preserve">- ☑ </w:t>
+      </w:r>
+      <w:r>
+        <w:rPr>
+          <w:strike/>
+        </w:rPr>
+        <w:t xml:space="preserve">Complete Markdown Parser AST with inline style translation</w:t>
+      </w:r>
+    </w:p>
+    <w:p>
+      <w:pPr>
+        <w:spacing w:after="140"/>
+      </w:pPr>
+      <w:r>
+        <w:t xml:space="preserve">- ☑ </w:t>
+      </w:r>
+      <w:r>
+        <w:rPr>
+          <w:strike/>
+        </w:rPr>
+        <w:t xml:space="preserve">Implement 5 Curated Professional Themes (Modern Slate, Executive Navy, Emerald, Crimson, Tech Violet)</w:t>
+      </w:r>
+    </w:p>
+    <w:p>
+      <w:pPr>
+        <w:spacing w:after="140"/>
+      </w:pPr>
+      <w:r>
+        <w:t xml:space="preserve">- ☑ </w:t>
+      </w:r>
+      <w:r>
+        <w:rPr>
+          <w:strike/>
+        </w:rPr>
+        <w:t xml:space="preserve">Build Google Drive API multipart upload with native `vnd.google-apps.document` conversion</w:t>
+      </w:r>
+    </w:p>
+    <w:p>
+      <w:pPr>
+        <w:spacing w:after="140"/>
+      </w:pPr>
+      <w:r>
+        <w:t xml:space="preserve">- ☑ </w:t>
+      </w:r>
+      <w:r>
+        <w:rPr>
+          <w:strike/>
+        </w:rPr>
+        <w:t xml:space="preserve">Support 1-Click zero-config Rich Clipboard copy (&lt;kbd style="display: inline-block; padding: 1.5pt 5pt; font-size: 8.5pt; font-family: monospace; line-height: 1.2; color: #1E293B; background-color: #F1F5F9; border: 1pt solid #CBD5E1; border-radius: 3pt; box-shadow: 0 1pt 0 #94A3B8;"&gt;Ctrl&lt;/kbd&gt; + &lt;kbd style="display: inline-block; padding: 1.5pt 5pt; font-size: 8.5pt; font-family: monospace; line-height: 1.2; color: #1E293B; background-color: #F1F5F9; border: 1pt solid #CBD5E1; border-radius: 3pt; box-shadow: 0 1pt 0 #94A3B8;"&gt;V&lt;/kbd&gt; into Google Docs)</w:t>
+      </w:r>
+    </w:p>
+    <w:p>
+      <w:pPr>
+        <w:spacing w:after="140"/>
+      </w:pPr>
+      <w:r>
+        <w:t xml:space="preserve">- ☑ </w:t>
+      </w:r>
+      <w:r>
+        <w:rPr>
+          <w:strike/>
+        </w:rPr>
+        <w:t xml:space="preserve">Build Live Side-by-Side Google Docs Preview Webview with smooth anchor jumping</w:t>
+      </w:r>
+    </w:p>
+    <w:p>
+      <w:pPr>
+        <w:spacing w:after="140"/>
+      </w:pPr>
+      <w:r>
+        <w:t xml:space="preserve">- ☑ </w:t>
+      </w:r>
+      <w:r>
+        <w:rPr>
+          <w:strike/>
+        </w:rPr>
+        <w:t xml:space="preserve">Provide local HTML and DOCX export capabilities</w:t>
+      </w:r>
+    </w:p>
+    <w:p>
+      <w:pPr>
+        <w:spacing w:after="140"/>
+      </w:pPr>
+      <w:r>
+        <w:t xml:space="preserve">- ☑ </w:t>
+      </w:r>
+      <w:r>
+        <w:rPr>
+          <w:strike/>
+        </w:rPr>
+        <w:t xml:space="preserve">Implement native `&lt;a name="..."&gt;` bookmarks for Table of Contents &amp; Cross-References</w:t>
+      </w:r>
+    </w:p>
+    <w:p>
+      <w:pPr>
+        <w:spacing w:after="140"/>
+      </w:pPr>
+      <w:r>
+        <w:t xml:space="preserve">- ☑ </w:t>
+      </w:r>
+      <w:r>
+        <w:rPr>
+          <w:strike/>
+        </w:rPr>
+        <w:t xml:space="preserve">Support manual `[TOC]` placement and configurable `toc_depth`</w:t>
+      </w:r>
+    </w:p>
+    <w:p>
+      <w:pPr>
+        <w:spacing w:after="140"/>
+      </w:pPr>
+      <w:r>
+        <w:t xml:space="preserve">- ☑ </w:t>
+      </w:r>
+      <w:r>
+        <w:rPr>
+          <w:strike/>
+        </w:rPr>
+        <w:t xml:space="preserve">Support Footnotes citations with bidirectional links</w:t>
+      </w:r>
+    </w:p>
+    <w:p>
+      <w:pPr>
+        <w:spacing w:after="140"/>
+      </w:pPr>
+      <w:r>
+        <w:t xml:space="preserve">- ☑ </w:t>
+      </w:r>
+      <w:r>
+        <w:rPr>
+          <w:strike/>
+        </w:rPr>
+        <w:t xml:space="preserve">Extended callout admonitions (12 types)</w:t>
       </w:r>
     </w:p>
     <w:p>
@@ -1973,6 +2142,8 @@
       </w:r>
     </w:p>
     <w:sectPr>
+      <w:headerReference w:type="default" r:id="rId6"/>
+      <w:footerReference w:type="default" r:id="rId7"/>
       <w:pgSz w:w="11906" w:h="16838" w:orient="portrait"/>
       <w:pgMar w:top="1440" w:right="1440" w:bottom="1440" w:left="1440" w:header="708" w:footer="708" w:gutter="0"/>
       <w:pgNumType/>
@@ -1986,6 +2157,47 @@
 <w:comments xmlns:cx="http://schemas.microsoft.com/office/drawing/2014/chartex" xmlns:cx1="http://schemas.microsoft.com/office/drawing/2015/9/8/chartex" xmlns:cx2="http://schemas.microsoft.com/office/drawing/2015/10/21/chartex" xmlns:cx3="http://schemas.microsoft.com/office/drawing/2016/5/9/chartex" xmlns:cx4="http://schemas.microsoft.com/office/drawing/2016/5/10/chartex" xmlns:cx5="http://schemas.microsoft.com/office/drawing/2016/5/11/chartex" xmlns:cx6="http://schemas.microsoft.com/office/drawing/2016/5/12/chartex" xmlns:cx7="http://schemas.microsoft.com/office/drawing/2016/5/13/chartex" xmlns:cx8="http://schemas.microsoft.com/office/drawing/2016/5/14/chartex" xmlns:mc="http://schemas.openxmlformats.org/markup-compatibility/2006" xmlns:aink="http://schemas.microsoft.com/office/drawing/2016/ink" xmlns:am3d="http://schemas.microsoft.com/office/drawing/2017/model3d" xmlns:o="urn:schemas-microsoft-com:office:office" xmlns:r="http://schemas.openxmlformats.org/officeDocument/2006/relationships" xmlns:m="http://schemas.openxmlformats.org/officeDocument/2006/math" xmlns:v="urn:schemas-microsoft-com:vml" xmlns:wp14="http://schemas.microsoft.com/office/word/2010/wordprocessingDrawing" xmlns:wp="http://schemas.openxmlformats.org/drawingml/2006/wordprocessingDrawing" xmlns:w10="urn:schemas-microsoft-com:office:word" xmlns:w="http://schemas.openxmlformats.org/wordprocessingml/2006/main" xmlns:w14="http://schemas.microsoft.com/office/word/2010/wordml" xmlns:w15="http://schemas.microsoft.com/office/word/2012/wordml" xmlns:w16cex="http://schemas.microsoft.com/office/word/2018/wordml/cex" xmlns:w16cid="http://schemas.microsoft.com/office/word/2016/wordml/cid" xmlns:w16="http://schemas.microsoft.com/office/word/2018/wordml" xmlns:w16sdtdh="http://schemas.microsoft.com/office/word/2020/wordml/sdtdatahash" xmlns:w16se="http://schemas.microsoft.com/office/word/2015/wordml/symex" xmlns:wpg="http://schemas.microsoft.com/office/word/2010/wordprocessingGroup" xmlns:wpi="http://schemas.microsoft.com/office/word/2010/wordprocessingInk" xmlns:wne="http://schemas.microsoft.com/office/word/2006/wordml" xmlns:wps="http://schemas.microsoft.com/office/word/2010/wordprocessingShape"/>
 </file>
 
+<file path=word/footer1.xml><?xml version="1.0" encoding="utf-8"?>
+<w:ftr xmlns:wpc="http://schemas.microsoft.com/office/word/2010/wordprocessingCanvas" xmlns:mc="http://schemas.openxmlformats.org/markup-compatibility/2006" xmlns:o="urn:schemas-microsoft-com:office:office" xmlns:r="http://schemas.openxmlformats.org/officeDocument/2006/relationships" xmlns:m="http://schemas.openxmlformats.org/officeDocument/2006/math" xmlns:v="urn:schemas-microsoft-com:vml" xmlns:wp14="http://schemas.microsoft.com/office/word/2010/wordprocessingDrawing" xmlns:wp="http://schemas.openxmlformats.org/drawingml/2006/wordprocessingDrawing" xmlns:w10="urn:schemas-microsoft-com:office:word" xmlns:w="http://schemas.openxmlformats.org/wordprocessingml/2006/main" xmlns:w14="http://schemas.microsoft.com/office/word/2010/wordml" xmlns:w15="http://schemas.microsoft.com/office/word/2012/wordml" xmlns:wpg="http://schemas.microsoft.com/office/word/2010/wordprocessingGroup" xmlns:wpi="http://schemas.microsoft.com/office/word/2010/wordprocessingInk" xmlns:wne="http://schemas.microsoft.com/office/word/2006/wordml" xmlns:wps="http://schemas.microsoft.com/office/word/2010/wordprocessingShape">
+  <w:p>
+    <w:pPr>
+      <w:jc w:val="right"/>
+    </w:pPr>
+    <w:r>
+      <w:rPr>
+        <w:color w:val="64748B"/>
+        <w:sz w:val="18"/>
+        <w:szCs w:val="18"/>
+      </w:rPr>
+      <w:t xml:space="preserve">Strictly Confidential • All Rights Reserved</w:t>
+    </w:r>
+    <w:r>
+      <w:rPr>
+        <w:color w:val="64748B"/>
+        <w:sz w:val="18"/>
+        <w:szCs w:val="18"/>
+      </w:rPr>
+      <w:t xml:space="preserve">    |    Page </w:t>
+    </w:r>
+    <w:r>
+      <w:fldChar w:fldCharType="begin"/>
+      <w:instrText xml:space="preserve">PAGE</w:instrText>
+      <w:fldChar w:fldCharType="separate"/>
+      <w:fldChar w:fldCharType="end"/>
+    </w:r>
+    <w:r>
+      <w:t xml:space="preserve"> of </w:t>
+    </w:r>
+    <w:r>
+      <w:fldChar w:fldCharType="begin"/>
+      <w:instrText xml:space="preserve">NUMPAGES</w:instrText>
+      <w:fldChar w:fldCharType="separate"/>
+      <w:fldChar w:fldCharType="end"/>
+    </w:r>
+  </w:p>
+</w:ftr>
+</file>
+
 <file path=word/footnotes.xml><?xml version="1.0" encoding="utf-8"?>
 <w:footnotes xmlns:wpc="http://schemas.microsoft.com/office/word/2010/wordprocessingCanvas" xmlns:mc="http://schemas.openxmlformats.org/markup-compatibility/2006" xmlns:o="urn:schemas-microsoft-com:office:office" xmlns:r="http://schemas.openxmlformats.org/officeDocument/2006/relationships" xmlns:m="http://schemas.openxmlformats.org/officeDocument/2006/math" xmlns:v="urn:schemas-microsoft-com:vml" xmlns:wp14="http://schemas.microsoft.com/office/word/2010/wordprocessingDrawing" xmlns:wp="http://schemas.openxmlformats.org/drawingml/2006/wordprocessingDrawing" xmlns:w10="urn:schemas-microsoft-com:office:word" xmlns:w="http://schemas.openxmlformats.org/wordprocessingml/2006/main" xmlns:w14="http://schemas.microsoft.com/office/word/2010/wordml" xmlns:w15="http://schemas.microsoft.com/office/word/2012/wordml" xmlns:wpg="http://schemas.microsoft.com/office/word/2010/wordprocessingGroup" xmlns:wpi="http://schemas.microsoft.com/office/word/2010/wordprocessingInk" xmlns:wne="http://schemas.microsoft.com/office/word/2006/wordml" xmlns:wps="http://schemas.microsoft.com/office/word/2010/wordprocessingShape" mc:Ignorable="w14 w15 wp14">
   <w:footnote w:type="separator" w:id="-1">
@@ -2021,6 +2233,24 @@
     </w:p>
   </w:footnote>
 </w:footnotes>
+</file>
+
+<file path=word/header1.xml><?xml version="1.0" encoding="utf-8"?>
+<w:hdr xmlns:wpc="http://schemas.microsoft.com/office/word/2010/wordprocessingCanvas" xmlns:mc="http://schemas.openxmlformats.org/markup-compatibility/2006" xmlns:o="urn:schemas-microsoft-com:office:office" xmlns:r="http://schemas.openxmlformats.org/officeDocument/2006/relationships" xmlns:m="http://schemas.openxmlformats.org/officeDocument/2006/math" xmlns:v="urn:schemas-microsoft-com:vml" xmlns:wp14="http://schemas.microsoft.com/office/word/2010/wordprocessingDrawing" xmlns:wp="http://schemas.openxmlformats.org/drawingml/2006/wordprocessingDrawing" xmlns:w10="urn:schemas-microsoft-com:office:word" xmlns:w="http://schemas.openxmlformats.org/wordprocessingml/2006/main" xmlns:w14="http://schemas.microsoft.com/office/word/2010/wordml" xmlns:w15="http://schemas.microsoft.com/office/word/2012/wordml" xmlns:wpg="http://schemas.microsoft.com/office/word/2010/wordprocessingGroup" xmlns:wpi="http://schemas.microsoft.com/office/word/2010/wordprocessingInk" xmlns:wne="http://schemas.microsoft.com/office/word/2006/wordml" xmlns:wps="http://schemas.microsoft.com/office/word/2010/wordprocessingShape" xmlns:cx="http://schemas.microsoft.com/office/drawing/2014/chartex" xmlns:cx1="http://schemas.microsoft.com/office/drawing/2015/9/8/chartex" xmlns:cx2="http://schemas.microsoft.com/office/drawing/2015/10/21/chartex" xmlns:cx3="http://schemas.microsoft.com/office/drawing/2016/5/9/chartex" xmlns:cx4="http://schemas.microsoft.com/office/drawing/2016/5/10/chartex" xmlns:cx5="http://schemas.microsoft.com/office/drawing/2016/5/11/chartex" xmlns:cx6="http://schemas.microsoft.com/office/drawing/2016/5/12/chartex" xmlns:cx7="http://schemas.microsoft.com/office/drawing/2016/5/13/chartex" xmlns:cx8="http://schemas.microsoft.com/office/drawing/2016/5/14/chartex" xmlns:w16cid="http://schemas.microsoft.com/office/word/2016/wordml/cid" xmlns:w16se="http://schemas.microsoft.com/office/word/2015/wordml/symex">
+  <w:p>
+    <w:pPr>
+      <w:jc w:val="right"/>
+    </w:pPr>
+    <w:r>
+      <w:rPr>
+        <w:color w:val="64748B"/>
+        <w:sz w:val="18"/>
+        <w:szCs w:val="18"/>
+      </w:rPr>
+      <w:t xml:space="preserve">ACME CORP • ENGINEERING STRATEGY REPORT</w:t>
+    </w:r>
+  </w:p>
+</w:hdr>
 </file>
 
 <file path=word/numbering.xml><?xml version="1.0" encoding="utf-8"?>

</xml_diff>

<commit_message>
fix(clipboard, viewer): fix Windows CF_HTML offsets, add dual-format clipboard, and enhance DOCX viewer with zoom, dark mode, code styles, and mammoth image support
</commit_message>
<xml_diff>
--- a/demo-sample.docx
+++ b/demo-sample.docx
@@ -4,7 +4,8 @@
   <w:body>
     <w:p>
       <w:pPr>
-        <w:spacing w:after="140"/>
+        <w:pStyle w:val="Title"/>
+        <w:spacing w:before="0" w:after="120"/>
       </w:pPr>
       <w:r>
         <w:rPr>
@@ -13,6 +14,7 @@
           <w:color w:val="0F172A"/>
           <w:sz w:val="52"/>
           <w:szCs w:val="52"/>
+          <w:rFonts w:ascii="Inter" w:cs="Inter" w:eastAsia="Inter" w:hAnsi="Inter"/>
         </w:rPr>
         <w:t xml:space="preserve">Quarterly Engineering &amp; Architecture Strategy</w:t>
       </w:r>
@@ -133,12 +135,19 @@
               <w:spacing w:after="0"/>
             </w:pPr>
             <w:r>
-              <w:rPr>
-                <w:color w:val="1E293B"/>
-                <w:sz w:val="21"/>
-                <w:szCs w:val="21"/>
-              </w:rPr>
-              <w:t xml:space="preserve">All specifications in this document adhere strictly to the highest industrial enterprise standards[^arch-study].</w:t>
+              <w:t xml:space="preserve">All specifications in this document adhere strictly to the highest industrial enterprise standards</w:t>
+            </w:r>
+            <w:r>
+              <w:rPr>
+                <w:b/>
+                <w:bCs/>
+                <w:color w:val="2563EB"/>
+                <w:vertAlign w:val="superscript"/>
+              </w:rPr>
+              <w:t xml:space="preserve">[arch-study]</w:t>
+            </w:r>
+            <w:r>
+              <w:t xml:space="preserve">.</w:t>
             </w:r>
           </w:p>
         </w:tc>
@@ -490,12 +499,63 @@
               <w:spacing w:after="0"/>
             </w:pPr>
             <w:r>
-              <w:rPr>
-                <w:color w:val="1E293B"/>
-                <w:sz w:val="21"/>
-                <w:szCs w:val="21"/>
-              </w:rPr>
-              <w:t xml:space="preserve">Use the **"Copy for Google Docs"** command (`Ctrl+Shift+P` -&gt; `Copy for Google Docs`), then press &lt;kbd&gt;Ctrl&lt;/kbd&gt; + &lt;kbd&gt;V&lt;/kbd&gt; inside any Google Doc for 100% style fidelity!</w:t>
+              <w:t xml:space="preserve">Use the </w:t>
+            </w:r>
+            <w:r>
+              <w:rPr>
+                <w:b/>
+                <w:bCs/>
+              </w:rPr>
+              <w:t xml:space="preserve">"Copy for Google Docs"</w:t>
+            </w:r>
+            <w:r>
+              <w:t xml:space="preserve"> command (</w:t>
+            </w:r>
+            <w:r>
+              <w:rPr>
+                <w:color w:val="2563EB"/>
+                <w:sz w:val="20"/>
+                <w:szCs w:val="20"/>
+                <w:rFonts w:ascii="Consolas" w:cs="Consolas" w:eastAsia="Consolas" w:hAnsi="Consolas"/>
+              </w:rPr>
+              <w:t xml:space="preserve">Ctrl+Shift+P</w:t>
+            </w:r>
+            <w:r>
+              <w:t xml:space="preserve"> -&gt; </w:t>
+            </w:r>
+            <w:r>
+              <w:rPr>
+                <w:color w:val="2563EB"/>
+                <w:sz w:val="20"/>
+                <w:szCs w:val="20"/>
+                <w:rFonts w:ascii="Consolas" w:cs="Consolas" w:eastAsia="Consolas" w:hAnsi="Consolas"/>
+              </w:rPr>
+              <w:t xml:space="preserve">Copy for Google Docs</w:t>
+            </w:r>
+            <w:r>
+              <w:t xml:space="preserve">), then press </w:t>
+            </w:r>
+            <w:r>
+              <w:rPr>
+                <w:b/>
+                <w:bCs/>
+                <w:rFonts w:ascii="Consolas" w:cs="Consolas" w:eastAsia="Consolas" w:hAnsi="Consolas"/>
+              </w:rPr>
+              <w:t xml:space="preserve">Ctrl</w:t>
+            </w:r>
+            <w:r>
+              <w:t xml:space="preserve"> + </w:t>
+            </w:r>
+            <w:r>
+              <w:rPr>
+                <w:b/>
+                <w:bCs/>
+                <w:rFonts w:ascii="Consolas" w:cs="Consolas" w:eastAsia="Consolas" w:hAnsi="Consolas"/>
+              </w:rPr>
+              <w:t xml:space="preserve">V</w:t>
+            </w:r>
+            <w:r>
+              <w:t xml:space="preserve"> inside any Google Doc for 100% style fidelity!</w:t>
             </w:r>
           </w:p>
         </w:tc>
@@ -577,11 +637,6 @@
               <w:spacing w:after="0"/>
             </w:pPr>
             <w:r>
-              <w:rPr>
-                <w:color w:val="1E293B"/>
-                <w:sz w:val="21"/>
-                <w:szCs w:val="21"/>
-              </w:rPr>
               <w:t xml:space="preserve">Real-time streaming metrics are collected and aggregated via Google Cloud Pub/Sub.</w:t>
             </w:r>
           </w:p>
@@ -640,11 +695,6 @@
               <w:spacing w:after="0"/>
             </w:pPr>
             <w:r>
-              <w:rPr>
-                <w:color w:val="1E293B"/>
-                <w:sz w:val="21"/>
-                <w:szCs w:val="21"/>
-              </w:rPr>
               <w:t xml:space="preserve">Automated test suite passed with 18 of 18 checks verified.</w:t>
             </w:r>
           </w:p>
@@ -703,12 +753,19 @@
               <w:spacing w:after="0"/>
             </w:pPr>
             <w:r>
-              <w:rPr>
-                <w:color w:val="1E293B"/>
-                <w:sz w:val="21"/>
-                <w:szCs w:val="21"/>
-              </w:rPr>
-              <w:t xml:space="preserve">Refer to the internal Developer Portal FAQ or reach out to `#platform-engineering`.</w:t>
+              <w:t xml:space="preserve">Refer to the internal Developer Portal FAQ or reach out to </w:t>
+            </w:r>
+            <w:r>
+              <w:rPr>
+                <w:color w:val="2563EB"/>
+                <w:sz w:val="20"/>
+                <w:szCs w:val="20"/>
+                <w:rFonts w:ascii="Consolas" w:cs="Consolas" w:eastAsia="Consolas" w:hAnsi="Consolas"/>
+              </w:rPr>
+              <w:t xml:space="preserve">#platform-engineering</w:t>
+            </w:r>
+            <w:r>
+              <w:t xml:space="preserve">.</w:t>
             </w:r>
           </w:p>
         </w:tc>
@@ -766,11 +823,6 @@
               <w:spacing w:after="0"/>
             </w:pPr>
             <w:r>
-              <w:rPr>
-                <w:color w:val="1E293B"/>
-                <w:sz w:val="21"/>
-                <w:szCs w:val="21"/>
-              </w:rPr>
               <w:t xml:space="preserve">Complete load testing on secondary staging cluster before Friday.</w:t>
             </w:r>
           </w:p>
@@ -829,12 +881,19 @@
               <w:spacing w:after="0"/>
             </w:pPr>
             <w:r>
-              <w:rPr>
-                <w:color w:val="1E293B"/>
-                <w:sz w:val="21"/>
-                <w:szCs w:val="21"/>
-              </w:rPr>
-              <w:t xml:space="preserve">Example command line execution: `npm test` runs all unit tests.</w:t>
+              <w:t xml:space="preserve">Example command line execution: </w:t>
+            </w:r>
+            <w:r>
+              <w:rPr>
+                <w:color w:val="2563EB"/>
+                <w:sz w:val="20"/>
+                <w:szCs w:val="20"/>
+                <w:rFonts w:ascii="Consolas" w:cs="Consolas" w:eastAsia="Consolas" w:hAnsi="Consolas"/>
+              </w:rPr>
+              <w:t xml:space="preserve">npm test</w:t>
+            </w:r>
+            <w:r>
+              <w:t xml:space="preserve"> runs all unit tests.</w:t>
             </w:r>
           </w:p>
         </w:tc>
@@ -892,11 +951,6 @@
               <w:spacing w:after="0"/>
             </w:pPr>
             <w:r>
-              <w:rPr>
-                <w:color w:val="1E293B"/>
-                <w:sz w:val="21"/>
-                <w:szCs w:val="21"/>
-              </w:rPr>
               <w:t xml:space="preserve">Expired tokens must be refreshed automatically before executing batch upload operations.</w:t>
             </w:r>
           </w:p>
@@ -955,11 +1009,6 @@
               <w:spacing w:after="0"/>
             </w:pPr>
             <w:r>
-              <w:rPr>
-                <w:color w:val="1E293B"/>
-                <w:sz w:val="21"/>
-                <w:szCs w:val="21"/>
-              </w:rPr>
               <w:t xml:space="preserve">Automatic circuit breakers will trip if downstream failure exceeds 5% within a 60-second window.</w:t>
             </w:r>
           </w:p>
@@ -1943,11 +1992,6 @@
               <w:spacing w:after="0"/>
             </w:pPr>
             <w:r>
-              <w:rPr>
-                <w:color w:val="1E293B"/>
-                <w:sz w:val="21"/>
-                <w:szCs w:val="21"/>
-              </w:rPr>
               <w:t xml:space="preserve">Ensure all database migration scripts are executed in staging before triggering production deployment.</w:t>
             </w:r>
           </w:p>

</xml_diff>